<commit_message>
Add CTT and CTT Request Portal user stories from high-level requirements
Reviewed high-level requirements against corporate BRD and added 23 new
user stories (CTT006-014, CRP001-011, OMS001-002, ER006) in As a/I want/so that
format. Updated scope, success metrics, summary of impacts, and glossary.

Co-authored-by: demodolly <demodolly@users.noreply.github.com>
</commit_message>
<xml_diff>
--- a/BRD - Workfront CTT Integration POC - Corporate Format.docx
+++ b/BRD - Workfront CTT Integration POC - Corporate Format.docx
@@ -21,7 +21,7 @@
             <w:r>
               <w:t>Workfront &amp; CTT Integration</w:t>
               <w:br/>
-              <w:t>1.0</w:t>
+              <w:t>1.1</w:t>
             </w:r>
           </w:p>
         </w:tc>
@@ -33,7 +33,7 @@
             <w:r>
               <w:t>High Level summary</w:t>
               <w:br/>
-              <w:t>Document the business requirements for a Proof of Concept to integrate Workfront and the Campaign Tagging and Tracking (CTT) tool as an interim compatibility layer during the transition to Workfront and Adobe North Star.</w:t>
+              <w:t>Document the business requirements for a Proof of Concept to integrate Workfront and the Campaign Tagging and Tracking (CTT) tool as an interim compatibility layer, including CTT field updates and CTT Request Portal changes to support FY27 reporting data elements.</w:t>
               <w:br/>
               <w:t>Author Name</w:t>
               <w:br/>
@@ -160,11 +160,53 @@
           </w:p>
         </w:tc>
       </w:tr>
+      <w:tr>
+        <w:tc>
+          <w:tcPr>
+            <w:tcW w:type="dxa" w:w="2256"/>
+          </w:tcPr>
+          <w:p>
+            <w:r>
+              <w:t>08/07/2026</w:t>
+            </w:r>
+          </w:p>
+        </w:tc>
+        <w:tc>
+          <w:tcPr>
+            <w:tcW w:type="dxa" w:w="2256"/>
+          </w:tcPr>
+          <w:p>
+            <w:r>
+              <w:t>1.1</w:t>
+            </w:r>
+          </w:p>
+        </w:tc>
+        <w:tc>
+          <w:tcPr>
+            <w:tcW w:type="dxa" w:w="2256"/>
+          </w:tcPr>
+          <w:p>
+            <w:r>
+              <w:t>Added CTT and CTT Request Portal user stories from high-level requirements</w:t>
+            </w:r>
+          </w:p>
+        </w:tc>
+        <w:tc>
+          <w:tcPr>
+            <w:tcW w:type="dxa" w:w="2256"/>
+          </w:tcPr>
+          <w:p>
+            <w:r>
+              <w:t>Amanda Pattenden</w:t>
+            </w:r>
+          </w:p>
+        </w:tc>
+      </w:tr>
     </w:tbl>
     <w:p/>
     <w:p>
       <w:pPr>
-        <w:pStyle w:val="TOCHeading"/>
+        <w:pStyle w:val="CiscoHeading"/>
       </w:pPr>
       <w:r>
         <w:t>Table of Contents</w:t>
@@ -319,6 +361,14 @@
         <w:pStyle w:val="TOC2"/>
       </w:pPr>
       <w:r>
+        <w:t>CTT Request Portal</w:t>
+      </w:r>
+    </w:p>
+    <w:p>
+      <w:pPr>
+        <w:pStyle w:val="TOC2"/>
+      </w:pPr>
+      <w:r>
         <w:t>Tray.io</w:t>
       </w:r>
     </w:p>
@@ -359,6 +409,14 @@
         <w:pStyle w:val="TOC2"/>
       </w:pPr>
       <w:r>
+        <w:t>OMS</w:t>
+      </w:r>
+    </w:p>
+    <w:p>
+      <w:pPr>
+        <w:pStyle w:val="TOC2"/>
+      </w:pPr>
+      <w:r>
         <w:t>Enriched Requirements</w:t>
       </w:r>
     </w:p>
@@ -416,7 +474,7 @@
         <w:pStyle w:val="CiscoNormal"/>
       </w:pPr>
       <w:r>
-        <w:t>An immediate cutover from CTT to Workfront-only reporting risks a measurement gap before all upstream and downstream dependencies are ready. Marketing has defined FY27 reporting data elements (e.g., Business Priority, Stakeholder Unit, campaign/program context) that must be captured consistently across all activities — including those originating in Workfront, in CTT, and outside Workfront entirely. Without an interim bridge, FY27 reporting data elements may not be captured consistently, teams may delay Workfront adoption, and attribution and funnel reporting remain exposed to legacy ID dependencies.</w:t>
+        <w:t>An immediate cutover from CTT to Workfront-only reporting risks a measurement gap before all upstream and downstream dependencies are ready. Marketing has defined FY27 reporting data elements (e.g., Business Priority, Stakeholder Unit, Funnel Stage, campaign/program context) that must be captured consistently across all activities — including those originating in Workfront, in CTT, and outside Workfront entirely.</w:t>
       </w:r>
     </w:p>
     <w:p>
@@ -432,7 +490,7 @@
         <w:pStyle w:val="CiscoNormal"/>
       </w:pPr>
       <w:r>
-        <w:t>The primary driver for this initiative is to execute a focused Proof of Concept (POC) that integrates Workfront with CTT as a temporary compatibility layer during the transition to Workfront as the marketing execution and data source of truth, and toward the longer-term Adobe North Star architecture and CTT decommissioning.</w:t>
+        <w:t>Execute a focused Proof of Concept (POC) that integrates Workfront with CTT as a temporary compatibility layer during the transition to Workfront as the marketing execution and data source of truth, and toward Adobe North Star and CTT decommissioning.</w:t>
       </w:r>
     </w:p>
     <w:p>
@@ -440,7 +498,7 @@
         <w:pStyle w:val="CiscoNormal"/>
       </w:pPr>
       <w:r>
-        <w:t>The POC will automatically create Activity IDs for channel activations and Offer IDs for content activations for selected Workfront activations, write generated IDs and shared FY27 attributes back to Workfront, and align CTT-carried attributes so Workfront-originated and non-Workfront activity can be reported using the same data elements. This is an interim bridge, not a detour — CTT is used only as a controlled compatibility layer with explicit exit criteria.</w:t>
+        <w:t>The POC will automatically create Activity IDs and Offer IDs for selected Workfront activations, write generated IDs and shared FY27 attributes back to Workfront, update CTT and CTT Request Portal fields to align with FY27 data standards, and produce decision-quality evidence for scale, pause, or stop decisions.</w:t>
       </w:r>
     </w:p>
     <w:p>
@@ -456,7 +514,7 @@
         <w:pStyle w:val="CiscoNormal"/>
       </w:pPr>
       <w:r>
-        <w:t>The Workfront &amp; CTT Integration POC benefits anyone relying on marketing data for FY27 reporting, analysis, or strategic decision-making, as well as the teams responsible for Workfront adoption, CTT operations, and integration delivery.</w:t>
+        <w:t>Marketing and Analytics Teams: Consistent FY27 data elements across Workfront and non-Workfront activity for earlier measurement and comparable performance analysis.</w:t>
       </w:r>
     </w:p>
     <w:p>
@@ -464,7 +522,7 @@
         <w:pStyle w:val="CiscoNormal"/>
       </w:pPr>
       <w:r>
-        <w:t>Marketing and Analytics Teams: Benefit from consistent FY27 data elements across Workfront and non-Workfront activity, enabling earlier measurement of FY27 priorities and comparable performance analysis.</w:t>
+        <w:t>Workfront Adoption Teams: Reduced adoption friction without manual ID administration or lost campaign measurement during transition.</w:t>
       </w:r>
     </w:p>
     <w:p>
@@ -472,7 +530,7 @@
         <w:pStyle w:val="CiscoNormal"/>
       </w:pPr>
       <w:r>
-        <w:t>Workfront Adoption Teams: Benefit from reduced adoption friction — teams can move to Workfront without manual ID administration or fear that campaign measurement will be lost during transition.</w:t>
+        <w:t>Reporting Teams: Consistent data model spanning Workfront-originated and CTT-originated activity for attribution and funnel reporting continuity.</w:t>
       </w:r>
     </w:p>
     <w:p>
@@ -480,7 +538,7 @@
         <w:pStyle w:val="CiscoNormal"/>
       </w:pPr>
       <w:r>
-        <w:t>Reporting Teams: Benefit from a consistent data model spanning Workfront-originated and CTT-originated activity, supporting attribution and funnel reporting continuity.</w:t>
+        <w:t>Marketing Operations Teams: Updated CTT and CTT Request Portal fields aligned to FY27 standards for teams not yet on Workfront.</w:t>
       </w:r>
     </w:p>
     <w:p>
@@ -488,7 +546,7 @@
         <w:pStyle w:val="CiscoNormal"/>
       </w:pPr>
       <w:r>
-        <w:t>Technology and Architecture Teams: Benefit from decision-quality evidence and a documented decommission backlog that accelerates the path to CTT retirement and Adobe North Star alignment.</w:t>
+        <w:t>Technology and Architecture Teams: Decision-quality evidence and documented decommission backlog accelerating CTT retirement.</w:t>
       </w:r>
     </w:p>
     <w:p>
@@ -496,7 +554,7 @@
         <w:pStyle w:val="CiscoNormal"/>
       </w:pPr>
       <w:r>
-        <w:t>CRM / One Cisco CRM Teams: Benefit from marketing tracking progress that does not require immediate SFDC tracking parameter changes during OCC work.</w:t>
+        <w:t>CRM / One Cisco CRM Teams: Marketing tracking progress without immediate SFDC tracking parameter changes.</w:t>
       </w:r>
     </w:p>
     <w:p>
@@ -568,7 +626,7 @@
         <w:pStyle w:val="CiscoListParagraph"/>
       </w:pPr>
       <w:r>
-        <w:t>Addition of FY27 data attributes (e.g., Business Priority, Stakeholder Unit) into CTT so non-Workfront teams can use IDs carrying the same data elements.</w:t>
+        <w:t>CTT Activity ID field updates: rename Business Unit to Stakeholder Unit; remove Buying Centre linkage; add Primary Technology and Funnel Stage; update Technology &gt; Campaign &gt; Program hierarchy.</w:t>
       </w:r>
     </w:p>
     <w:p>
@@ -576,6 +634,30 @@
         <w:pStyle w:val="CiscoListParagraph"/>
       </w:pPr>
       <w:r>
+        <w:t>CTT Offer ID field updates: add Technology/Campaign/Program alignment; standardize Offer Type list.</w:t>
+      </w:r>
+    </w:p>
+    <w:p>
+      <w:pPr>
+        <w:pStyle w:val="CiscoListParagraph"/>
+      </w:pPr>
+      <w:r>
+        <w:t>CTT Request Portal updates across Activity ID and Offer ID request, edit, update existing, and bulk upload workflows.</w:t>
+      </w:r>
+    </w:p>
+    <w:p>
+      <w:pPr>
+        <w:pStyle w:val="CiscoListParagraph"/>
+      </w:pPr>
+      <w:r>
+        <w:t>Publication of new CTT field values to OMS tables (excluding Tray.io, Allocadia, and SFDC APIs during bridge period).</w:t>
+      </w:r>
+    </w:p>
+    <w:p>
+      <w:pPr>
+        <w:pStyle w:val="CiscoListParagraph"/>
+      </w:pPr>
+      <w:r>
         <w:t>Build of a pilot dataset spanning Workfront-originated and CTT-originated activity with reporting validation.</w:t>
       </w:r>
     </w:p>
@@ -608,7 +690,7 @@
         <w:pStyle w:val="CiscoListParagraph"/>
       </w:pPr>
       <w:r>
-        <w:t>Complete decommissioning and removal of the CTT tool and all integrations (separate initiative — see Decommission BRD v3.0).</w:t>
+        <w:t>Complete decommissioning and removal of the CTT tool and all integrations (separate initiative).</w:t>
       </w:r>
     </w:p>
     <w:p>
@@ -624,7 +706,7 @@
         <w:pStyle w:val="CiscoListParagraph"/>
       </w:pPr>
       <w:r>
-        <w:t>Enterprise-wide Workfront adoption or fundamental changes to how projects, tasks, or budgeting are managed within Workfront beyond pilot configuration.</w:t>
+        <w:t>Enterprise-wide Workfront adoption beyond pilot configuration.</w:t>
       </w:r>
     </w:p>
     <w:p>
@@ -632,7 +714,7 @@
         <w:pStyle w:val="CiscoListParagraph"/>
       </w:pPr>
       <w:r>
-        <w:t>Historical migration or transformation of legacy OCID data (CCIDs, DTIDs, OIDs) to Task ID / UTM standards.</w:t>
+        <w:t>Historical migration or transformation of legacy OCID data.</w:t>
       </w:r>
     </w:p>
     <w:p>
@@ -640,7 +722,7 @@
         <w:pStyle w:val="CiscoListParagraph"/>
       </w:pPr>
       <w:r>
-        <w:t>Upgrading, migrating, or replacing core systems (Eloqua, Allocadia, SFDC, etc.).</w:t>
+        <w:t>Upgrading, migrating, or replacing core systems (Eloqua, Allocadia, SFDC).</w:t>
       </w:r>
     </w:p>
     <w:p>
@@ -648,7 +730,7 @@
         <w:pStyle w:val="CiscoListParagraph"/>
       </w:pPr>
       <w:r>
-        <w:t>Remediation of all 28 documented CTT dependencies — the POC produces a prioritized backlog, not full delivery.</w:t>
+        <w:t>Remediation of all 28 documented CTT dependencies.</w:t>
       </w:r>
     </w:p>
     <w:p>
@@ -672,7 +754,7 @@
         <w:pStyle w:val="CiscoNormal"/>
       </w:pPr>
       <w:r>
-        <w:t>FY27 Data Element Stability: Marketing-defined FY27 data elements (e.g., Business Priority, Stakeholder Unit) are finalized or sufficiently stable for POC configuration.</w:t>
+        <w:t>FY27 Data Element Stability: Marketing-defined FY27 data elements are finalized or sufficiently stable for POC configuration.</w:t>
       </w:r>
     </w:p>
     <w:p>
@@ -680,7 +762,7 @@
         <w:pStyle w:val="CiscoNormal"/>
       </w:pPr>
       <w:r>
-        <w:t>Task ID Readiness: The Workfront Task ID is available and usable as a reference identifier for pilot activations.</w:t>
+        <w:t>Task ID Readiness: Workfront Task ID is available and usable as a reference identifier for pilot activations.</w:t>
       </w:r>
     </w:p>
     <w:p>
@@ -688,7 +770,7 @@
         <w:pStyle w:val="CiscoNormal"/>
       </w:pPr>
       <w:r>
-        <w:t>CTT Configurability: CTT can be configured with interim bridge fields to carry Workfront-aligned attributes during transition.</w:t>
+        <w:t>CTT Configurability: CTT and CTT Request Portal can be configured with updated fields and bridge attributes.</w:t>
       </w:r>
     </w:p>
     <w:p>
@@ -696,7 +778,7 @@
         <w:pStyle w:val="CiscoNormal"/>
       </w:pPr>
       <w:r>
-        <w:t>Pilot Scope: A suitable pilot activation type exists with manageable Workfront and CTT dependencies.</w:t>
+        <w:t>Pilot Scope: A suitable pilot activation type exists with manageable dependencies.</w:t>
       </w:r>
     </w:p>
     <w:p>
@@ -704,7 +786,7 @@
         <w:pStyle w:val="CiscoNormal"/>
       </w:pPr>
       <w:r>
-        <w:t>Resource Availability: Dedicated resources from Workfront, CTT/Integration, and Marketing Reporting teams will be assigned and prioritized.</w:t>
+        <w:t>Resource Availability: Dedicated resources from Workfront, CTT/Integration, and Marketing Reporting teams will be assigned.</w:t>
       </w:r>
     </w:p>
     <w:p>
@@ -712,7 +794,7 @@
         <w:pStyle w:val="CiscoNormal"/>
       </w:pPr>
       <w:r>
-        <w:t>Interim Intent: This POC is explicitly temporary; CTT remains on the decommission path with defined exit criteria.</w:t>
+        <w:t>Interim Intent: CTT remains on the decommission path with defined exit criteria.</w:t>
       </w:r>
     </w:p>
     <w:p>
@@ -728,7 +810,7 @@
         <w:pStyle w:val="CiscoNormal"/>
       </w:pPr>
       <w:r>
-        <w:t>Decommission Alignment: POC findings will inform — not replace — the broader CTT decommission initiative.</w:t>
+        <w:t>OMS Readiness: OMS tables can receive updated CTT field values for reporting consumption.</w:t>
       </w:r>
     </w:p>
     <w:p>
@@ -752,7 +834,7 @@
         <w:pStyle w:val="CiscoNormal"/>
       </w:pPr>
       <w:r>
-        <w:t>CTT Bridge Configuration: CTT/integration owner must configure bridge fields and ID creation/write-back flow.</w:t>
+        <w:t>CTT Bridge Configuration: CTT owner must configure updated Activity ID, Offer ID fields and ID creation/write-back flow.</w:t>
       </w:r>
     </w:p>
     <w:p>
@@ -760,7 +842,7 @@
         <w:pStyle w:val="CiscoNormal"/>
       </w:pPr>
       <w:r>
-        <w:t>FY27 Data Element Definition: Marketing reporting owner must define and validate FY27 data elements and acceptance criteria.</w:t>
+        <w:t>CTT Request Portal Configuration: CTT owner must update portal forms, edit, and bulk upload workflows.</w:t>
       </w:r>
     </w:p>
     <w:p>
@@ -768,6 +850,22 @@
         <w:pStyle w:val="CiscoNormal"/>
       </w:pPr>
       <w:r>
+        <w:t>FY27 Data Element Definition: Marketing reporting owner must define and validate FY27 data elements.</w:t>
+      </w:r>
+    </w:p>
+    <w:p>
+      <w:pPr>
+        <w:pStyle w:val="CiscoNormal"/>
+      </w:pPr>
+      <w:r>
+        <w:t>OMS Publication: Data engineering must publish new field values to OMS tables.</w:t>
+      </w:r>
+    </w:p>
+    <w:p>
+      <w:pPr>
+        <w:pStyle w:val="CiscoNormal"/>
+      </w:pPr>
+      <w:r>
         <w:t>Pilot Selection: Business sponsor must select pilot activation type and business area.</w:t>
       </w:r>
     </w:p>
@@ -776,7 +874,15 @@
         <w:pStyle w:val="CiscoNormal"/>
       </w:pPr>
       <w:r>
-        <w:t>CTT Dependency Inventory: Existing dependency audit (28 dependencies: 16 mandatory, 2 conditional, 10 operational) informs scope and exit planning.</w:t>
+        <w:t>Executive Alignment: Leadership approval and named resource owners confirmed before build phase.</w:t>
+      </w:r>
+    </w:p>
+    <w:p>
+      <w:pPr>
+        <w:pStyle w:val="CiscoSubHeader"/>
+      </w:pPr>
+      <w:r>
+        <w:t>Success Metrics</w:t>
       </w:r>
     </w:p>
     <w:p>
@@ -784,7 +890,7 @@
         <w:pStyle w:val="CiscoNormal"/>
       </w:pPr>
       <w:r>
-        <w:t>Reporting Environment: Marketing reporting team must provide environment for pilot dataset and sample report validation.</w:t>
+        <w:t>Integration Feasibility: 100% of selected Workfront activations receive expected Activity or Offer ID with write-back.</w:t>
       </w:r>
     </w:p>
     <w:p>
@@ -792,7 +898,63 @@
         <w:pStyle w:val="CiscoNormal"/>
       </w:pPr>
       <w:r>
-        <w:t>Executive Alignment: Leadership approval and named resource owners confirmed before build phase.</w:t>
+        <w:t>CTT Field Alignment: All updated CTT and CTT Request Portal fields deployed with standardized picklists and hierarchies.</w:t>
+      </w:r>
+    </w:p>
+    <w:p>
+      <w:pPr>
+        <w:pStyle w:val="CiscoNormal"/>
+      </w:pPr>
+      <w:r>
+        <w:t>Data Quality: Required FY27 attributes populated with ≥95% completeness for pilot activations.</w:t>
+      </w:r>
+    </w:p>
+    <w:p>
+      <w:pPr>
+        <w:pStyle w:val="CiscoNormal"/>
+      </w:pPr>
+      <w:r>
+        <w:t>Reporting Continuity: Workfront-originated and non-Workfront activities reportable using same FY27 data elements.</w:t>
+      </w:r>
+    </w:p>
+    <w:p>
+      <w:pPr>
+        <w:pStyle w:val="CiscoNormal"/>
+      </w:pPr>
+      <w:r>
+        <w:t>OMS Publication: New CTT field values available in OMS tables for reporting validation.</w:t>
+      </w:r>
+    </w:p>
+    <w:p>
+      <w:pPr>
+        <w:pStyle w:val="CiscoNormal"/>
+      </w:pPr>
+      <w:r>
+        <w:t>Operational Fit: Pilot users complete activation workflow without manual ID administration.</w:t>
+      </w:r>
+    </w:p>
+    <w:p>
+      <w:pPr>
+        <w:pStyle w:val="CiscoNormal"/>
+      </w:pPr>
+      <w:r>
+        <w:t>Decommission Readiness: Prioritized backlog produced for CTT dependency replacement.</w:t>
+      </w:r>
+    </w:p>
+    <w:p>
+      <w:pPr>
+        <w:pStyle w:val="CiscoNormal"/>
+      </w:pPr>
+      <w:r>
+        <w:t>Decision Output: Formal scale, pause, or stop recommendation delivered to leadership.</w:t>
+      </w:r>
+    </w:p>
+    <w:p>
+      <w:pPr>
+        <w:pStyle w:val="CiscoHeading"/>
+      </w:pPr>
+      <w:r>
+        <w:t>Business Process</w:t>
       </w:r>
     </w:p>
     <w:p>
@@ -800,7 +962,7 @@
         <w:pStyle w:val="CiscoSubHeader"/>
       </w:pPr>
       <w:r>
-        <w:t>Success Metrics</w:t>
+        <w:t>Business Process – As Is (Current State)</w:t>
       </w:r>
     </w:p>
     <w:p>
@@ -808,7 +970,15 @@
         <w:pStyle w:val="CiscoNormal"/>
       </w:pPr>
       <w:r>
-        <w:t>Integration Feasibility: Workfront triggers CTT ID creation and receives generated IDs back as usable data attributes for 100% of selected pilot activations.</w:t>
+        <w:t>CTT creates and validates legacy identifiers (Activity ID, Offer ID, Drive To ID / OCIDs). Workfront adoption is incomplete. Reporting depends on OCIDs across CDF, Ace Reporting, and Adobe Weblogs. Marketing teams request IDs through the CTT Request Tool with Business Unit, Buying Centre &gt; Campaign Theme &gt; Program hierarchy, and legacy Offer Type values. IDs flow via Tray.io to SFDC, Eloqua, and lead enrichment.</w:t>
+      </w:r>
+    </w:p>
+    <w:p>
+      <w:pPr>
+        <w:pStyle w:val="CiscoSubHeader"/>
+      </w:pPr>
+      <w:r>
+        <w:t>Business Process – To Be (Future State)</w:t>
       </w:r>
     </w:p>
     <w:p>
@@ -816,7 +986,7 @@
         <w:pStyle w:val="CiscoNormal"/>
       </w:pPr>
       <w:r>
-        <w:t>Write-Back Quality: Generated IDs and agreed FY27 attributes are written back to Workfront with ≥95% completeness.</w:t>
+        <w:t>&lt;Is the future state of an as-is process in the format of a business process flow&gt;</w:t>
       </w:r>
     </w:p>
     <w:p>
@@ -824,7 +994,47 @@
         <w:pStyle w:val="CiscoNormal"/>
       </w:pPr>
       <w:r>
-        <w:t>Reporting Continuity: Workfront-originated and non-Workfront activities can be reported using the same FY27 data elements in a validated sample report.</w:t>
+        <w:t>POC Bridge State (Interim):</w:t>
+      </w:r>
+    </w:p>
+    <w:p>
+      <w:pPr>
+        <w:pStyle w:val="CiscoListParagraph"/>
+      </w:pPr>
+      <w:r>
+        <w:t>Marketing team creates/approves activation in Workfront (pilot scope) OR requests IDs via updated CTT Request Portal.</w:t>
+      </w:r>
+    </w:p>
+    <w:p>
+      <w:pPr>
+        <w:pStyle w:val="CiscoListParagraph"/>
+      </w:pPr>
+      <w:r>
+        <w:t>Workfront triggers automatic Activity/Offer ID creation in CTT; portal users submit requests with new Stakeholder Unit, Technology &gt; Campaign &gt; Program, and Funnel Stage fields.</w:t>
+      </w:r>
+    </w:p>
+    <w:p>
+      <w:pPr>
+        <w:pStyle w:val="CiscoListParagraph"/>
+      </w:pPr>
+      <w:r>
+        <w:t>CTT carries Workfront-aligned FY27 data attributes; generated IDs written back to Workfront.</w:t>
+      </w:r>
+    </w:p>
+    <w:p>
+      <w:pPr>
+        <w:pStyle w:val="CiscoListParagraph"/>
+      </w:pPr>
+      <w:r>
+        <w:t>New field values published to OMS tables for reporting; excluded from Tray, Allocadia, and SFDC APIs during bridge.</w:t>
+      </w:r>
+    </w:p>
+    <w:p>
+      <w:pPr>
+        <w:pStyle w:val="CiscoListParagraph"/>
+      </w:pPr>
+      <w:r>
+        <w:t>Reporting uses common FY27 data elements across Workfront-originated and CTT-originated activity.</w:t>
       </w:r>
     </w:p>
     <w:p>
@@ -832,199 +1042,7 @@
         <w:pStyle w:val="CiscoNormal"/>
       </w:pPr>
       <w:r>
-        <w:t>Operational Fit: Pilot users can request or approve activations without adding manual ID administration burden.</w:t>
-      </w:r>
-    </w:p>
-    <w:p>
-      <w:pPr>
-        <w:pStyle w:val="CiscoNormal"/>
-      </w:pPr>
-      <w:r>
-        <w:t>Decommission Readiness: POC produces a concrete, prioritized backlog for replacing CTT dependencies and retiring legacy OCIDs.</w:t>
-      </w:r>
-    </w:p>
-    <w:p>
-      <w:pPr>
-        <w:pStyle w:val="CiscoNormal"/>
-      </w:pPr>
-      <w:r>
-        <w:t>CRM Protection: Marketing progresses without requiring immediate SFDC / One Cisco CRM tracking changes.</w:t>
-      </w:r>
-    </w:p>
-    <w:p>
-      <w:pPr>
-        <w:pStyle w:val="CiscoNormal"/>
-      </w:pPr>
-      <w:r>
-        <w:t>Decision Output: Formal scale, pause, or stop recommendation delivered to leadership with next-phase backlog.</w:t>
-      </w:r>
-    </w:p>
-    <w:p>
-      <w:pPr>
-        <w:pStyle w:val="CiscoHeading"/>
-      </w:pPr>
-      <w:r>
-        <w:t>Business Process</w:t>
-      </w:r>
-    </w:p>
-    <w:p>
-      <w:pPr>
-        <w:pStyle w:val="CiscoSubHeader"/>
-      </w:pPr>
-      <w:r>
-        <w:t>Business Process – As Is (Current State)</w:t>
-      </w:r>
-    </w:p>
-    <w:p>
-      <w:pPr>
-        <w:pStyle w:val="CiscoNormal"/>
-      </w:pPr>
-      <w:r>
-        <w:t>Today, CTT creates and validates legacy identifiers (Activity ID, Offer ID, Drive To ID / OCIDs). Workfront adoption is incomplete — not all marketing activities pass through Workfront. Reporting depends on OCIDs across multiple systems including CDF, Ace Reporting, and Adobe Weblogs. CTT IDs are mandatory for lead creation, routing (Lean Data, Outreach/Gong Engage), and SFDC campaign alignment. Integrations via Tray.io, SFDC, Allocadia, Eloqua, and App Cloud Lite depend on CTT attributes. Marketing teams requesting new activations manually request IDs through the CTT Request Tool or CTTG, with IDs flowing downstream to SFDC campaigns, lead enrichment, and reporting.</w:t>
-      </w:r>
-    </w:p>
-    <w:p>
-      <w:pPr>
-        <w:pStyle w:val="CiscoNormal"/>
-      </w:pPr>
-      <w:r>
-        <w:t>Current State Flow:</w:t>
-      </w:r>
-    </w:p>
-    <w:p>
-      <w:pPr>
-        <w:pStyle w:val="CiscoListParagraph"/>
-      </w:pPr>
-      <w:r>
-        <w:t>Marketing team creates activation request (Workfront and/or CTT Request Tool).</w:t>
-      </w:r>
-    </w:p>
-    <w:p>
-      <w:pPr>
-        <w:pStyle w:val="CiscoListParagraph"/>
-      </w:pPr>
-      <w:r>
-        <w:t>CTT creates Activity ID and/or Offer ID; Drive To ID assigned for channel activations.</w:t>
-      </w:r>
-    </w:p>
-    <w:p>
-      <w:pPr>
-        <w:pStyle w:val="CiscoListParagraph"/>
-      </w:pPr>
-      <w:r>
-        <w:t>IDs flow via Tray.io to SFDC (campaign creation), Eloqua (picklists, forms), and lead enrichment.</w:t>
-      </w:r>
-    </w:p>
-    <w:p>
-      <w:pPr>
-        <w:pStyle w:val="CiscoListParagraph"/>
-      </w:pPr>
-      <w:r>
-        <w:t>Customer touchpoints capture OCIDs via ctm.js, URL parameters, form landing pages, and local storage.</w:t>
-      </w:r>
-    </w:p>
-    <w:p>
-      <w:pPr>
-        <w:pStyle w:val="CiscoListParagraph"/>
-      </w:pPr>
-      <w:r>
-        <w:t>Reporting pulls from CDF Transaction Tables and OCID-based data sources.</w:t>
-      </w:r>
-    </w:p>
-    <w:p>
-      <w:pPr>
-        <w:pStyle w:val="CiscoSubHeader"/>
-      </w:pPr>
-      <w:r>
-        <w:t>Business Process – To Be (Future State)</w:t>
-      </w:r>
-    </w:p>
-    <w:p>
-      <w:pPr>
-        <w:pStyle w:val="CiscoNormal"/>
-      </w:pPr>
-      <w:r>
-        <w:t>&lt;Is the future state of an as-is process in the format of a business process flow&gt;</w:t>
-      </w:r>
-    </w:p>
-    <w:p>
-      <w:pPr>
-        <w:pStyle w:val="CiscoNormal"/>
-      </w:pPr>
-      <w:r>
-        <w:t>POC Bridge State (Interim):</w:t>
-      </w:r>
-    </w:p>
-    <w:p>
-      <w:pPr>
-        <w:pStyle w:val="CiscoListParagraph"/>
-      </w:pPr>
-      <w:r>
-        <w:t>Marketing team creates/approves activation in Workfront (pilot scope).</w:t>
-      </w:r>
-    </w:p>
-    <w:p>
-      <w:pPr>
-        <w:pStyle w:val="CiscoListParagraph"/>
-      </w:pPr>
-      <w:r>
-        <w:t>Workfront triggers automatic Activity ID and/or Offer ID creation in CTT.</w:t>
-      </w:r>
-    </w:p>
-    <w:p>
-      <w:pPr>
-        <w:pStyle w:val="CiscoListParagraph"/>
-      </w:pPr>
-      <w:r>
-        <w:t>CTT carries Workfront-aligned FY27 data attributes (Business Priority, Stakeholder Unit, etc.).</w:t>
-      </w:r>
-    </w:p>
-    <w:p>
-      <w:pPr>
-        <w:pStyle w:val="CiscoListParagraph"/>
-      </w:pPr>
-      <w:r>
-        <w:t>Generated IDs and key attributes are written back to Workfront.</w:t>
-      </w:r>
-    </w:p>
-    <w:p>
-      <w:pPr>
-        <w:pStyle w:val="CiscoListParagraph"/>
-      </w:pPr>
-      <w:r>
-        <w:t>Non-Workfront teams continue using CTT IDs with the same future-state attributes.</w:t>
-      </w:r>
-    </w:p>
-    <w:p>
-      <w:pPr>
-        <w:pStyle w:val="CiscoListParagraph"/>
-      </w:pPr>
-      <w:r>
-        <w:t>Reporting uses common FY27 data elements across Workfront-originated and CTT-originated activity.</w:t>
-      </w:r>
-    </w:p>
-    <w:p>
-      <w:pPr>
-        <w:pStyle w:val="CiscoListParagraph"/>
-      </w:pPr>
-      <w:r>
-        <w:t>POC produces decommission evidence and backlog for CTT retirement.</w:t>
-      </w:r>
-    </w:p>
-    <w:p>
-      <w:pPr>
-        <w:pStyle w:val="CiscoNormal"/>
-      </w:pPr>
-      <w:r>
-        <w:t>Target End State (Post-Decommission):</w:t>
-      </w:r>
-    </w:p>
-    <w:p>
-      <w:pPr>
-        <w:pStyle w:val="CiscoNormal"/>
-      </w:pPr>
-      <w:r>
-        <w:t>Workfront becomes the source of truth for marketing execution and governed reporting data. Task ID and standardized UTM values replace legacy OCIDs. CTT is decommissioned when readiness criteria are met. Reporting uses Workfront data and standardized UTMs without intermediary CTT or CDF Transaction Table dependencies.</w:t>
+        <w:t>Target End State: Workfront as source of truth; Task ID and UTM values replace OCIDs; CTT decommissioned when readiness criteria met.</w:t>
       </w:r>
     </w:p>
     <w:p>
@@ -1130,7 +1148,7 @@
           </w:tcPr>
           <w:p>
             <w:r>
-              <w:t>Systems requiring integration changes or configuration for the Workfront-CTT bridge</w:t>
+              <w:t>Systems requiring integration or configuration changes</w:t>
             </w:r>
           </w:p>
         </w:tc>
@@ -1162,7 +1180,7 @@
           </w:tcPr>
           <w:p>
             <w:r>
-              <w:t>Activity and offer management, CTT operations, pilot execution</w:t>
+              <w:t>CTT operations, portal administration, pilot execution</w:t>
             </w:r>
           </w:p>
         </w:tc>
@@ -1194,7 +1212,7 @@
           </w:tcPr>
           <w:p>
             <w:r>
-              <w:t>Workfront configuration, field governance, and pilot user management</w:t>
+              <w:t>Workfront configuration and pilot user management</w:t>
             </w:r>
           </w:p>
         </w:tc>
@@ -1226,7 +1244,7 @@
           </w:tcPr>
           <w:p>
             <w:r>
-              <w:t>FY27 data element definition, reporting validation, and sample report delivery</w:t>
+              <w:t>FY27 data element definition and reporting validation</w:t>
             </w:r>
           </w:p>
         </w:tc>
@@ -1258,7 +1276,7 @@
           </w:tcPr>
           <w:p>
             <w:r>
-              <w:t>Requirements that enhance transition confidence and decommission readiness beyond minimum POC scope</w:t>
+              <w:t>Requirements enhancing transition confidence beyond minimum POC scope</w:t>
             </w:r>
           </w:p>
         </w:tc>
@@ -1310,7 +1328,7 @@
         <w:pStyle w:val="CiscoNormal"/>
       </w:pPr>
       <w:r>
-        <w:t>WF004: As a Workfront Administrator, I want agreed FY27 attributes (Business Priority, Stakeholder Unit, campaign/program context, Task ID, UTM attributes) captured on Workfront records and available for integration, so that data is consistent with the bridge-period reporting model.</w:t>
+        <w:t>WF004: As a Workfront Administrator, I want agreed FY27 attributes (Business Priority, Stakeholder Unit, Funnel Stage, campaign/program context, Task ID, UTM attributes) captured on Workfront records and available for integration, so that data is consistent with the bridge-period reporting model.</w:t>
       </w:r>
     </w:p>
     <w:p>
@@ -1371,9 +1389,177 @@
     </w:p>
     <w:p>
       <w:pPr>
+        <w:pStyle w:val="CiscoNormal"/>
+      </w:pPr>
+      <w:r>
+        <w:t>CTT006: As a Data Governance Lead, I want the Activity ID field "Business Unit" renamed to "Stakeholder Unit" with a standardized list of values (Brand Marketing, Cisco Live, Communications, Integrated Marketing, Field Marketing, Lifecycle Marketing, Product Marketing, Partner, Sales, and other approved units), so that FY27 reporting uses consistent stakeholder attribution across all activities.</w:t>
+      </w:r>
+    </w:p>
+    <w:p>
+      <w:pPr>
+        <w:pStyle w:val="CiscoNormal"/>
+      </w:pPr>
+      <w:r>
+        <w:t>CTT007: As a Marketing Manager, I want the linkage between Campaign and Buying Centre removed from the Activity ID UI, so that I can select campaigns and programs from a distinct list without unnecessary buying centre constraints.</w:t>
+      </w:r>
+    </w:p>
+    <w:p>
+      <w:pPr>
+        <w:pStyle w:val="CiscoNormal"/>
+      </w:pPr>
+      <w:r>
+        <w:t>CTT008: As a Marketing Manager, I want a Primary Technology field added to Activity ID that determines which campaigns and programs are available for selection, so that campaign and program choices are filtered to align with the technology being marketed.</w:t>
+      </w:r>
+    </w:p>
+    <w:p>
+      <w:pPr>
+        <w:pStyle w:val="CiscoNormal"/>
+      </w:pPr>
+      <w:r>
+        <w:t>CTT009: As a Marketing Manager, I want a Funnel Stage field added to Activity ID with values Awareness, Consideration, Evaluation, and Decision, so that marketing activities are tagged to the correct funnel position for FY27 reporting and attribution.</w:t>
+      </w:r>
+    </w:p>
+    <w:p>
+      <w:pPr>
+        <w:pStyle w:val="CiscoNormal"/>
+      </w:pPr>
+      <w:r>
+        <w:t>CTT010: As a Marketing Manager, I want a distinct list of campaigns with corresponding programs on Activity ID (independent of buying centre), so that I can accurately align my channel activation to the correct campaign hierarchy.</w:t>
+      </w:r>
+    </w:p>
+    <w:p>
+      <w:pPr>
+        <w:pStyle w:val="CiscoNormal"/>
+      </w:pPr>
+      <w:r>
+        <w:t>CTT011: As a Marketing Manager, I want Offer ID to include the same Technology, Campaign, and Program alignment fields as Activity ID, so that content activations carry consistent campaign hierarchy attributes for reporting.</w:t>
+      </w:r>
+    </w:p>
+    <w:p>
+      <w:pPr>
+        <w:pStyle w:val="CiscoNormal"/>
+      </w:pPr>
+      <w:r>
+        <w:t>CTT012: As a Marketing Manager, I want the Offer Type field updated to a standardized list organized by Collateral (e.g., At-A-Glance, Data Sheet, White Paper), Gated (e.g., Demo, Trial, Contact Us), and All Else optional categories (e.g., Blog, Webinar, Video), so that offer classification is consistent across all content activations.</w:t>
+      </w:r>
+    </w:p>
+    <w:p>
+      <w:pPr>
+        <w:pStyle w:val="CiscoNormal"/>
+      </w:pPr>
+      <w:r>
+        <w:t>CTT013: As a Data Engineer, I want all new and updated CTT field values published to OMS tables, so that reporting and downstream data consumers can access the updated attribute model.</w:t>
+      </w:r>
+    </w:p>
+    <w:p>
+      <w:pPr>
+        <w:pStyle w:val="CiscoNormal"/>
+      </w:pPr>
+      <w:r>
+        <w:t>CTT014: As an Integration Engineer, I want new CTT field values excluded from Tray.io, Allocadia, and SFDC API integrations during the bridge period, so that existing downstream integrations are not disrupted while CTT field changes are validated.</w:t>
+      </w:r>
+    </w:p>
+    <w:p>
+      <w:pPr>
         <w:pStyle w:val="CiscoSubHeader"/>
       </w:pPr>
       <w:r>
+        <w:t>CTT Request Portal</w:t>
+      </w:r>
+    </w:p>
+    <w:p>
+      <w:pPr>
+        <w:pStyle w:val="CiscoNormal"/>
+      </w:pPr>
+      <w:r>
+        <w:t>CRP001: As a Marketing Manager, I want the CTT Request Portal Stakeholder Group field updated to use the same standardized values as CTT Stakeholder Unit, so that portal submissions align with the updated stakeholder taxonomy.</w:t>
+      </w:r>
+    </w:p>
+    <w:p>
+      <w:pPr>
+        <w:pStyle w:val="CiscoNormal"/>
+      </w:pPr>
+      <w:r>
+        <w:t>CRP002: As a Marketing Manager, I want the CTT Request Portal selection hierarchy changed from Buying Centre &gt; Campaign Theme &gt; Program to Technology &gt; Campaign &gt; Program, so that the portal reflects the new campaign alignment model.</w:t>
+      </w:r>
+    </w:p>
+    <w:p>
+      <w:pPr>
+        <w:pStyle w:val="CiscoNormal"/>
+      </w:pPr>
+      <w:r>
+        <w:t>CRP003: As a Marketing Manager, I want a Funnel Stage field added to Activity ID requests in the CTT Request Portal with values Awareness, Consideration, Evaluation, and Decision, so that I can specify the funnel position when requesting new Activity IDs.</w:t>
+      </w:r>
+    </w:p>
+    <w:p>
+      <w:pPr>
+        <w:pStyle w:val="CiscoNormal"/>
+      </w:pPr>
+      <w:r>
+        <w:t>CRP004: As a Marketing Manager, I want the Activity ID "Update Existing" function amended with the new Stakeholder Group list, Technology &gt; Campaign &gt; Program hierarchy, and Funnel Stage field, so that I can update legacy Activity ID records to the new data model.</w:t>
+      </w:r>
+    </w:p>
+    <w:p>
+      <w:pPr>
+        <w:pStyle w:val="CiscoNormal"/>
+      </w:pPr>
+      <w:r>
+        <w:t>CRP005: As a Marketing Operations Specialist, I want the Activity ID bulk upload template amended with the new Technology &gt; Campaign &gt; Program hierarchy, Stakeholder list, and Funnel Stage field, so that bulk ID requests align with the updated standards.</w:t>
+      </w:r>
+    </w:p>
+    <w:p>
+      <w:pPr>
+        <w:pStyle w:val="CiscoNormal"/>
+      </w:pPr>
+      <w:r>
+        <w:t>CRP006: As a Marketing Manager, I want the Offer ID request form in the CTT Request Portal updated with the new standardized Offer Type list, so that offer classification matches the updated CTT taxonomy.</w:t>
+      </w:r>
+    </w:p>
+    <w:p>
+      <w:pPr>
+        <w:pStyle w:val="CiscoNormal"/>
+      </w:pPr>
+      <w:r>
+        <w:t>CRP007: As a Marketing Manager, I want the Buying Centre field removed from Offer ID requests in the CTT Request Portal, so that the portal reflects the simplified Technology &gt; Campaign &gt; Program alignment model.</w:t>
+      </w:r>
+    </w:p>
+    <w:p>
+      <w:pPr>
+        <w:pStyle w:val="CiscoNormal"/>
+      </w:pPr>
+      <w:r>
+        <w:t>CRP008: As a Marketing Manager, I want the question "Do you wish to align your offer to a campaign and program as well as a buying centre" removed from Offer ID requests, so that the offer request process is simplified and aligned to the new hierarchy.</w:t>
+      </w:r>
+    </w:p>
+    <w:p>
+      <w:pPr>
+        <w:pStyle w:val="CiscoNormal"/>
+      </w:pPr>
+      <w:r>
+        <w:t>CRP009: As a Marketing Manager, I want Technology &gt; Campaign &gt; Program and Funnel Stage fields added to Offer ID requests in the CTT Request Portal, so that offer requests capture the same alignment attributes as Activity IDs.</w:t>
+      </w:r>
+    </w:p>
+    <w:p>
+      <w:pPr>
+        <w:pStyle w:val="CiscoNormal"/>
+      </w:pPr>
+      <w:r>
+        <w:t>CRP010: As a Marketing Manager, I want the same field updates (Stakeholder, Technology/Campaign/Program, Funnel Stage, Offer Type) applied to Offer ID Edit options in the CTT Request Portal, so that offer edits use consistent data standards.</w:t>
+      </w:r>
+    </w:p>
+    <w:p>
+      <w:pPr>
+        <w:pStyle w:val="CiscoNormal"/>
+      </w:pPr>
+      <w:r>
+        <w:t>CRP011: As a Marketing Operations Specialist, I want the Offer ID bulk upload template amended with the new Stakeholder list, Technology &gt; Campaign &gt; Program hierarchy, Funnel Stage, and Offer Type values, so that bulk offer ID requests align with the updated standards.</w:t>
+      </w:r>
+    </w:p>
+    <w:p>
+      <w:pPr>
+        <w:pStyle w:val="CiscoSubHeader"/>
+      </w:pPr>
+      <w:r>
         <w:t>Tray.io</w:t>
       </w:r>
     </w:p>
@@ -1422,7 +1608,7 @@
         <w:pStyle w:val="CiscoNormal"/>
       </w:pPr>
       <w:r>
-        <w:t>RE002: As a Reporting Analyst, I want a sample report that segments activity by origin (Workfront vs. non-Workfront), channel vs. content, and agreed FY27 attributes, so that leadership can assess whether the bridge meets reporting needs.</w:t>
+        <w:t>RE002: As a Reporting Analyst, I want a sample report that segments activity by origin (Workfront vs. non-Workfront), channel vs. content, and agreed FY27 attributes including Stakeholder Unit and Funnel Stage, so that leadership can assess whether the bridge meets reporting needs.</w:t>
       </w:r>
     </w:p>
     <w:p>
@@ -1510,6 +1696,30 @@
         <w:pStyle w:val="CiscoSubHeader"/>
       </w:pPr>
       <w:r>
+        <w:t>OMS</w:t>
+      </w:r>
+    </w:p>
+    <w:p>
+      <w:pPr>
+        <w:pStyle w:val="CiscoNormal"/>
+      </w:pPr>
+      <w:r>
+        <w:t>OMS001: As a Data Engineer, I want all new CTT field values (Stakeholder Unit, Primary Technology, Funnel Stage, Technology/Campaign/Program, Offer Type) published to OMS tables, so that reporting teams can validate FY27 data elements from a centralized source.</w:t>
+      </w:r>
+    </w:p>
+    <w:p>
+      <w:pPr>
+        <w:pStyle w:val="CiscoNormal"/>
+      </w:pPr>
+      <w:r>
+        <w:t>OMS002: As a Reporting Analyst, I want OMS tables to reflect the updated CTT attribute model before pilot reporting validation begins, so that sample reports use the same data source as future-state reporting.</w:t>
+      </w:r>
+    </w:p>
+    <w:p>
+      <w:pPr>
+        <w:pStyle w:val="CiscoSubHeader"/>
+      </w:pPr>
+      <w:r>
         <w:t>Enriched Requirements</w:t>
       </w:r>
     </w:p>
@@ -1518,7 +1728,7 @@
         <w:pStyle w:val="CiscoNormal"/>
       </w:pPr>
       <w:r>
-        <w:t>The core POC ensures Workfront can trigger CTT ID creation, receive write-back, and support consistent FY27 reporting across activity types. The following enriched requirements enhance transition confidence and decommission readiness:</w:t>
+        <w:t>The core POC ensures Workfront can trigger CTT ID creation, CTT and portal fields are aligned to FY27 standards, and reporting continuity is validated.</w:t>
       </w:r>
     </w:p>
     <w:p>
@@ -1559,6 +1769,14 @@
       </w:pPr>
       <w:r>
         <w:t>ER005: As an Architecture Lead, I want the POC architecture assessed for scalability beyond the pilot, so that a scale decision does not require complete redesign.</w:t>
+      </w:r>
+    </w:p>
+    <w:p>
+      <w:pPr>
+        <w:pStyle w:val="CiscoNormal"/>
+      </w:pPr>
+      <w:r>
+        <w:t>ER006: As a Data Governance Lead, I want a reference data appendix documenting all Stakeholder Unit, Funnel Stage, Technology/Campaign/Program, and Offer Type values, so that field governance is maintained across CTT and the Request Portal.</w:t>
       </w:r>
     </w:p>
     <w:p>
@@ -1638,7 +1856,7 @@
           </w:tcPr>
           <w:p>
             <w:r>
-              <w:t>Configure pilot fields for Task ID, write-back of Activity/Offer IDs, and FY27 attributes; trigger CTT ID creation on activation approval</w:t>
+              <w:t>Configure pilot fields; trigger CTT ID creation; receive write-back of IDs and FY27 attributes</w:t>
             </w:r>
           </w:p>
         </w:tc>
@@ -1660,7 +1878,7 @@
           </w:tcPr>
           <w:p>
             <w:r>
-              <w:t>CTT</w:t>
+              <w:t>CTT Activity ID</w:t>
             </w:r>
           </w:p>
         </w:tc>
@@ -1670,7 +1888,7 @@
           </w:tcPr>
           <w:p>
             <w:r>
-              <w:t>Add bridge fields for FY27 attributes; accept Workfront-triggered ID creation; maintain existing downstream ID flows during pilot</w:t>
+              <w:t>Rename Business Unit to Stakeholder Unit; remove Buying Centre linkage; add Primary Technology, Funnel Stage; update Campaign/Program hierarchy</w:t>
             </w:r>
           </w:p>
         </w:tc>
@@ -1680,7 +1898,7 @@
           </w:tcPr>
           <w:p>
             <w:r>
-              <w:t>Integration</w:t>
+              <w:t>Process</w:t>
             </w:r>
           </w:p>
         </w:tc>
@@ -1692,7 +1910,7 @@
           </w:tcPr>
           <w:p>
             <w:r>
-              <w:t>Tray.io</w:t>
+              <w:t>CTT Offer ID</w:t>
             </w:r>
           </w:p>
         </w:tc>
@@ -1702,7 +1920,7 @@
           </w:tcPr>
           <w:p>
             <w:r>
-              <w:t>Build Workfront-to-CTT ID creation flow and write-back to Workfront; log integration events</w:t>
+              <w:t>Add Technology/Campaign/Program alignment; standardize Offer Type list</w:t>
             </w:r>
           </w:p>
         </w:tc>
@@ -1712,7 +1930,7 @@
           </w:tcPr>
           <w:p>
             <w:r>
-              <w:t>Integration</w:t>
+              <w:t>Process</w:t>
             </w:r>
           </w:p>
         </w:tc>
@@ -1724,7 +1942,7 @@
           </w:tcPr>
           <w:p>
             <w:r>
-              <w:t>Marketing Reporting</w:t>
+              <w:t>CTT Request Portal</w:t>
             </w:r>
           </w:p>
         </w:tc>
@@ -1734,7 +1952,7 @@
           </w:tcPr>
           <w:p>
             <w:r>
-              <w:t>Define FY27 data elements; build pilot dataset and sample report; validate reporting continuity</w:t>
+              <w:t>Update Stakeholder Group, Technology/Campaign/Program, Funnel Stage, Offer Type across request, edit, update existing, and bulk upload workflows</w:t>
             </w:r>
           </w:p>
         </w:tc>
@@ -1756,7 +1974,7 @@
           </w:tcPr>
           <w:p>
             <w:r>
-              <w:t>Salesforce</w:t>
+              <w:t>Tray.io</w:t>
             </w:r>
           </w:p>
         </w:tc>
@@ -1766,7 +1984,7 @@
           </w:tcPr>
           <w:p>
             <w:r>
-              <w:t>No changes during POC; existing Activity/Offer ID campaign alignment continues</w:t>
+              <w:t>Build Workfront-to-CTT ID creation flow and write-back; log integration events</w:t>
             </w:r>
           </w:p>
         </w:tc>
@@ -1776,7 +1994,7 @@
           </w:tcPr>
           <w:p>
             <w:r>
-              <w:t>No Change</w:t>
+              <w:t>Integration</w:t>
             </w:r>
           </w:p>
         </w:tc>
@@ -1788,7 +2006,7 @@
           </w:tcPr>
           <w:p>
             <w:r>
-              <w:t>Eloqua</w:t>
+              <w:t>OMS Tables</w:t>
             </w:r>
           </w:p>
         </w:tc>
@@ -1798,7 +2016,7 @@
           </w:tcPr>
           <w:p>
             <w:r>
-              <w:t>No changes during POC; existing CTT picklist and form dependencies continue</w:t>
+              <w:t>Publish all new CTT field values for reporting consumption</w:t>
             </w:r>
           </w:p>
         </w:tc>
@@ -1808,7 +2026,7 @@
           </w:tcPr>
           <w:p>
             <w:r>
-              <w:t>No Change</w:t>
+              <w:t>Integration</w:t>
             </w:r>
           </w:p>
         </w:tc>
@@ -1820,7 +2038,7 @@
           </w:tcPr>
           <w:p>
             <w:r>
-              <w:t>CDF</w:t>
+              <w:t>Marketing Reporting</w:t>
             </w:r>
           </w:p>
         </w:tc>
@@ -1830,7 +2048,7 @@
           </w:tcPr>
           <w:p>
             <w:r>
-              <w:t>No changes during POC; document CDF dependency for decommission backlog</w:t>
+              <w:t>Define FY27 data elements; build pilot dataset and sample report</w:t>
             </w:r>
           </w:p>
         </w:tc>
@@ -1852,7 +2070,7 @@
           </w:tcPr>
           <w:p>
             <w:r>
-              <w:t>Allocadia</w:t>
+              <w:t>Salesforce</w:t>
             </w:r>
           </w:p>
         </w:tc>
@@ -1862,7 +2080,7 @@
           </w:tcPr>
           <w:p>
             <w:r>
-              <w:t>No changes during POC</w:t>
+              <w:t>No changes during POC; existing ID campaign alignment continues</w:t>
             </w:r>
           </w:p>
         </w:tc>
@@ -1884,7 +2102,7 @@
           </w:tcPr>
           <w:p>
             <w:r>
-              <w:t>Lean Data / Gong Engage</w:t>
+              <w:t>Eloqua</w:t>
             </w:r>
           </w:p>
         </w:tc>
@@ -1894,7 +2112,7 @@
           </w:tcPr>
           <w:p>
             <w:r>
-              <w:t>No changes during POC; existing routing dependencies continue</w:t>
+              <w:t>No changes during POC</w:t>
             </w:r>
           </w:p>
         </w:tc>
@@ -1916,7 +2134,7 @@
           </w:tcPr>
           <w:p>
             <w:r>
-              <w:t>Ace Reporting / Adobe Weblogs</w:t>
+              <w:t>Allocadia</w:t>
             </w:r>
           </w:p>
         </w:tc>
@@ -1926,7 +2144,7 @@
           </w:tcPr>
           <w:p>
             <w:r>
-              <w:t>Sample report validation only; no production report changes during POC</w:t>
+              <w:t>Excluded from new CTT field API exposure during bridge</w:t>
             </w:r>
           </w:p>
         </w:tc>
@@ -1936,7 +2154,7 @@
           </w:tcPr>
           <w:p>
             <w:r>
-              <w:t>Process</w:t>
+              <w:t>No Change</w:t>
             </w:r>
           </w:p>
         </w:tc>
@@ -1948,6 +2166,38 @@
           </w:tcPr>
           <w:p>
             <w:r>
+              <w:t>CDF</w:t>
+            </w:r>
+          </w:p>
+        </w:tc>
+        <w:tc>
+          <w:tcPr>
+            <w:tcW w:type="dxa" w:w="3009"/>
+          </w:tcPr>
+          <w:p>
+            <w:r>
+              <w:t>Document CDF dependency for decommission backlog</w:t>
+            </w:r>
+          </w:p>
+        </w:tc>
+        <w:tc>
+          <w:tcPr>
+            <w:tcW w:type="dxa" w:w="3009"/>
+          </w:tcPr>
+          <w:p>
+            <w:r>
+              <w:t>Process</w:t>
+            </w:r>
+          </w:p>
+        </w:tc>
+      </w:tr>
+      <w:tr>
+        <w:tc>
+          <w:tcPr>
+            <w:tcW w:type="dxa" w:w="3009"/>
+          </w:tcPr>
+          <w:p>
+            <w:r>
               <w:t>Non-Workfront Teams</w:t>
             </w:r>
           </w:p>
@@ -1958,7 +2208,7 @@
           </w:tcPr>
           <w:p>
             <w:r>
-              <w:t>Continue using CTT Request Tool with aligned FY27 attributes on new IDs</w:t>
+              <w:t>Continue using updated CTT Request Portal with aligned FY27 attributes</w:t>
             </w:r>
           </w:p>
         </w:tc>
@@ -2054,7 +2304,7 @@
           </w:tcPr>
           <w:p>
             <w:r>
-              <w:t>CTT identifier tracking a marketing activity (channel activation) and program alignment</w:t>
+              <w:t>CTT identifier tracking a marketing activity (channel activation)</w:t>
             </w:r>
           </w:p>
         </w:tc>
@@ -2066,7 +2316,7 @@
           </w:tcPr>
           <w:p>
             <w:r>
-              <w:t>Adobe North Star</w:t>
+              <w:t>CTT</w:t>
             </w:r>
           </w:p>
         </w:tc>
@@ -2076,7 +2326,7 @@
           </w:tcPr>
           <w:p>
             <w:r>
-              <w:t>Target marketing technology and data architecture for unified intelligence and automation</w:t>
+              <w:t>Campaign Tagging and Tracking Tool</w:t>
             </w:r>
           </w:p>
         </w:tc>
@@ -2088,7 +2338,7 @@
           </w:tcPr>
           <w:p>
             <w:r>
-              <w:t>BRD</w:t>
+              <w:t>CTT Request Portal</w:t>
             </w:r>
           </w:p>
         </w:tc>
@@ -2098,7 +2348,7 @@
           </w:tcPr>
           <w:p>
             <w:r>
-              <w:t>Business Requirements Document</w:t>
+              <w:t>Web portal for manual Activity ID, Offer ID, and Drive To ID requests</w:t>
             </w:r>
           </w:p>
         </w:tc>
@@ -2110,7 +2360,7 @@
           </w:tcPr>
           <w:p>
             <w:r>
-              <w:t>CCID</w:t>
+              <w:t>Funnel Stage</w:t>
             </w:r>
           </w:p>
         </w:tc>
@@ -2120,7 +2370,7 @@
           </w:tcPr>
           <w:p>
             <w:r>
-              <w:t>Common Campaign ID — also referred to as Activity ID; subset of OCIDs</w:t>
+              <w:t>Marketing funnel position: Awareness, Consideration, Evaluation, Decision</w:t>
             </w:r>
           </w:p>
         </w:tc>
@@ -2132,7 +2382,7 @@
           </w:tcPr>
           <w:p>
             <w:r>
-              <w:t>CDF</w:t>
+              <w:t>OCID</w:t>
             </w:r>
           </w:p>
         </w:tc>
@@ -2142,7 +2392,7 @@
           </w:tcPr>
           <w:p>
             <w:r>
-              <w:t>Customer Data Foundation — data layer used in reporting</w:t>
+              <w:t>Omni Channel ID — collective term for legacy identifiers (CCID, OID, DTID)</w:t>
             </w:r>
           </w:p>
         </w:tc>
@@ -2154,7 +2404,7 @@
           </w:tcPr>
           <w:p>
             <w:r>
-              <w:t>CTT</w:t>
+              <w:t>Offer ID</w:t>
             </w:r>
           </w:p>
         </w:tc>
@@ -2164,7 +2414,7 @@
           </w:tcPr>
           <w:p>
             <w:r>
-              <w:t>Campaign Tagging and Tracking Tool — legacy system for ID creation, validation, and attribute management</w:t>
+              <w:t>CTT identifier tracking content consumed by customers</w:t>
             </w:r>
           </w:p>
         </w:tc>
@@ -2176,7 +2426,7 @@
           </w:tcPr>
           <w:p>
             <w:r>
-              <w:t>CTTG</w:t>
+              <w:t>OMS</w:t>
             </w:r>
           </w:p>
         </w:tc>
@@ -2186,7 +2436,7 @@
           </w:tcPr>
           <w:p>
             <w:r>
-              <w:t>Campaign Tagging and Tracking Generator — automated ID creation component</w:t>
+              <w:t>Operational Management System tables used for reporting data consumption</w:t>
             </w:r>
           </w:p>
         </w:tc>
@@ -2198,7 +2448,7 @@
           </w:tcPr>
           <w:p>
             <w:r>
-              <w:t>DTID</w:t>
+              <w:t>Primary Technology</w:t>
             </w:r>
           </w:p>
         </w:tc>
@@ -2208,7 +2458,7 @@
           </w:tcPr>
           <w:p>
             <w:r>
-              <w:t>Drive To ID — CTT identifier tracking the channel that delivered a marketing touchpoint</w:t>
+              <w:t>Field determining available Technology/Campaign/Program selections</w:t>
             </w:r>
           </w:p>
         </w:tc>
@@ -2220,7 +2470,7 @@
           </w:tcPr>
           <w:p>
             <w:r>
-              <w:t>FY27</w:t>
+              <w:t>Stakeholder Unit</w:t>
             </w:r>
           </w:p>
         </w:tc>
@@ -2230,7 +2480,7 @@
           </w:tcPr>
           <w:p>
             <w:r>
-              <w:t>Fiscal Year 2027 — reporting period for which Marketing has defined new data elements</w:t>
+              <w:t>Organizational unit responsible for the marketing activity (formerly Business Unit)</w:t>
             </w:r>
           </w:p>
         </w:tc>
@@ -2242,7 +2492,7 @@
           </w:tcPr>
           <w:p>
             <w:r>
-              <w:t>KPI</w:t>
+              <w:t>Task ID</w:t>
             </w:r>
           </w:p>
         </w:tc>
@@ -2252,7 +2502,7 @@
           </w:tcPr>
           <w:p>
             <w:r>
-              <w:t>Key Performance Indicators</w:t>
+              <w:t>Workfront task identifier — target replacement for legacy OCIDs</w:t>
             </w:r>
           </w:p>
         </w:tc>
@@ -2264,7 +2514,7 @@
           </w:tcPr>
           <w:p>
             <w:r>
-              <w:t>OCID</w:t>
+              <w:t>UTM</w:t>
             </w:r>
           </w:p>
         </w:tc>
@@ -2274,7 +2524,7 @@
           </w:tcPr>
           <w:p>
             <w:r>
-              <w:t>Omni Channel ID — collective term for legacy identifiers (CCID, OID, DTID)</w:t>
+              <w:t>Urchin Tracking Module — standard web tracking parameters</w:t>
             </w:r>
           </w:p>
         </w:tc>
@@ -2286,7 +2536,7 @@
           </w:tcPr>
           <w:p>
             <w:r>
-              <w:t>OCC</w:t>
+              <w:t>Workfront</w:t>
             </w:r>
           </w:p>
         </w:tc>
@@ -2296,161 +2546,7 @@
           </w:tcPr>
           <w:p>
             <w:r>
-              <w:t>One Cisco CRM — CRM transformation program constraining SFDC changes</w:t>
-            </w:r>
-          </w:p>
-        </w:tc>
-      </w:tr>
-      <w:tr>
-        <w:tc>
-          <w:tcPr>
-            <w:tcW w:type="dxa" w:w="4513"/>
-          </w:tcPr>
-          <w:p>
-            <w:r>
-              <w:t>Offer ID (OID)</w:t>
-            </w:r>
-          </w:p>
-        </w:tc>
-        <w:tc>
-          <w:tcPr>
-            <w:tcW w:type="dxa" w:w="4513"/>
-          </w:tcPr>
-          <w:p>
-            <w:r>
-              <w:t>CTT identifier tracking content consumed by customers</w:t>
-            </w:r>
-          </w:p>
-        </w:tc>
-      </w:tr>
-      <w:tr>
-        <w:tc>
-          <w:tcPr>
-            <w:tcW w:type="dxa" w:w="4513"/>
-          </w:tcPr>
-          <w:p>
-            <w:r>
-              <w:t>POC</w:t>
-            </w:r>
-          </w:p>
-        </w:tc>
-        <w:tc>
-          <w:tcPr>
-            <w:tcW w:type="dxa" w:w="4513"/>
-          </w:tcPr>
-          <w:p>
-            <w:r>
-              <w:t>Proof of Concept — limited pilot to validate feasibility and produce decision evidence</w:t>
-            </w:r>
-          </w:p>
-        </w:tc>
-      </w:tr>
-      <w:tr>
-        <w:tc>
-          <w:tcPr>
-            <w:tcW w:type="dxa" w:w="4513"/>
-          </w:tcPr>
-          <w:p>
-            <w:r>
-              <w:t>SFDC</w:t>
-            </w:r>
-          </w:p>
-        </w:tc>
-        <w:tc>
-          <w:tcPr>
-            <w:tcW w:type="dxa" w:w="4513"/>
-          </w:tcPr>
-          <w:p>
-            <w:r>
-              <w:t>Salesforce.com</w:t>
-            </w:r>
-          </w:p>
-        </w:tc>
-      </w:tr>
-      <w:tr>
-        <w:tc>
-          <w:tcPr>
-            <w:tcW w:type="dxa" w:w="4513"/>
-          </w:tcPr>
-          <w:p>
-            <w:r>
-              <w:t>SLA</w:t>
-            </w:r>
-          </w:p>
-        </w:tc>
-        <w:tc>
-          <w:tcPr>
-            <w:tcW w:type="dxa" w:w="4513"/>
-          </w:tcPr>
-          <w:p>
-            <w:r>
-              <w:t>Service Level Agreement</w:t>
-            </w:r>
-          </w:p>
-        </w:tc>
-      </w:tr>
-      <w:tr>
-        <w:tc>
-          <w:tcPr>
-            <w:tcW w:type="dxa" w:w="4513"/>
-          </w:tcPr>
-          <w:p>
-            <w:r>
-              <w:t>Task ID</w:t>
-            </w:r>
-          </w:p>
-        </w:tc>
-        <w:tc>
-          <w:tcPr>
-            <w:tcW w:type="dxa" w:w="4513"/>
-          </w:tcPr>
-          <w:p>
-            <w:r>
-              <w:t>Workfront task identifier — target replacement for legacy OCIDs</w:t>
-            </w:r>
-          </w:p>
-        </w:tc>
-      </w:tr>
-      <w:tr>
-        <w:tc>
-          <w:tcPr>
-            <w:tcW w:type="dxa" w:w="4513"/>
-          </w:tcPr>
-          <w:p>
-            <w:r>
-              <w:t>UTM</w:t>
-            </w:r>
-          </w:p>
-        </w:tc>
-        <w:tc>
-          <w:tcPr>
-            <w:tcW w:type="dxa" w:w="4513"/>
-          </w:tcPr>
-          <w:p>
-            <w:r>
-              <w:t>Urchin Tracking Module — standard web tracking parameters (source, medium, campaign, etc.)</w:t>
-            </w:r>
-          </w:p>
-        </w:tc>
-      </w:tr>
-      <w:tr>
-        <w:tc>
-          <w:tcPr>
-            <w:tcW w:type="dxa" w:w="4513"/>
-          </w:tcPr>
-          <w:p>
-            <w:r>
-              <w:t>Workfront</w:t>
-            </w:r>
-          </w:p>
-        </w:tc>
-        <w:tc>
-          <w:tcPr>
-            <w:tcW w:type="dxa" w:w="4513"/>
-          </w:tcPr>
-          <w:p>
-            <w:r>
-              <w:t>Adobe Workfront — marketing execution and project management platform (strategic destination)</w:t>
+              <w:t>Adobe Workfront — marketing execution platform (strategic destination)</w:t>
             </w:r>
           </w:p>
         </w:tc>
@@ -2718,82 +2814,6 @@
             <w:r>
               <w:t>X</w:t>
             </w:r>
-          </w:p>
-        </w:tc>
-        <w:tc>
-          <w:tcPr>
-            <w:tcW w:type="dxa" w:w="2256"/>
-          </w:tcPr>
-          <w:p>
-            <w:r/>
-          </w:p>
-        </w:tc>
-      </w:tr>
-      <w:tr>
-        <w:tc>
-          <w:tcPr>
-            <w:tcW w:type="dxa" w:w="2256"/>
-          </w:tcPr>
-          <w:p>
-            <w:r>
-              <w:t>_TBD — IT / Engineering Lead</w:t>
-            </w:r>
-          </w:p>
-        </w:tc>
-        <w:tc>
-          <w:tcPr>
-            <w:tcW w:type="dxa" w:w="2256"/>
-          </w:tcPr>
-          <w:p>
-            <w:r>
-              <w:t>X</w:t>
-            </w:r>
-          </w:p>
-        </w:tc>
-        <w:tc>
-          <w:tcPr>
-            <w:tcW w:type="dxa" w:w="2256"/>
-          </w:tcPr>
-          <w:p>
-            <w:r/>
-          </w:p>
-        </w:tc>
-        <w:tc>
-          <w:tcPr>
-            <w:tcW w:type="dxa" w:w="2256"/>
-          </w:tcPr>
-          <w:p>
-            <w:r/>
-          </w:p>
-        </w:tc>
-      </w:tr>
-      <w:tr>
-        <w:tc>
-          <w:tcPr>
-            <w:tcW w:type="dxa" w:w="2256"/>
-          </w:tcPr>
-          <w:p>
-            <w:r>
-              <w:t>_TBD — CRM / SFDC Representative</w:t>
-            </w:r>
-          </w:p>
-        </w:tc>
-        <w:tc>
-          <w:tcPr>
-            <w:tcW w:type="dxa" w:w="2256"/>
-          </w:tcPr>
-          <w:p>
-            <w:r>
-              <w:t>X</w:t>
-            </w:r>
-          </w:p>
-        </w:tc>
-        <w:tc>
-          <w:tcPr>
-            <w:tcW w:type="dxa" w:w="2256"/>
-          </w:tcPr>
-          <w:p>
-            <w:r/>
           </w:p>
         </w:tc>
         <w:tc>

</xml_diff>